<commit_message>
vault backup: 2026-01-04 14:58:29
</commit_message>
<xml_diff>
--- a/2025军事理论知识要点.docx
+++ b/2025军事理论知识要点.docx
@@ -14,367 +14,377 @@
           <w:szCs w:val="24"/>
         </w:rPr>
       </w:pPr>
+      <w:r>
+        <w:rPr>
+          <w:rFonts w:ascii="Times New Roman" w:hAnsi="Times New Roman"/>
+          <w:b/>
+          <w:sz w:val="24"/>
+          <w:szCs w:val="24"/>
+        </w:rPr>
+        <w:t>第一部分  中国国防</w:t>
+      </w:r>
+    </w:p>
+    <w:p>
+      <w:pPr>
+        <w:pStyle w:val="16"/>
+        <w:spacing w:line="360" w:lineRule="auto"/>
+        <w:rPr>
+          <w:rFonts w:ascii="Times New Roman" w:hAnsi="Times New Roman"/>
+          <w:b/>
+          <w:sz w:val="24"/>
+          <w:szCs w:val="24"/>
+        </w:rPr>
+      </w:pPr>
+      <w:r>
+        <w:rPr>
+          <w:rFonts w:ascii="Times New Roman" w:hAnsi="Times New Roman"/>
+          <w:b/>
+          <w:sz w:val="24"/>
+          <w:szCs w:val="24"/>
+        </w:rPr>
+        <w:t>1、什么是国防：国防是“国家为防备和抵抗侵略，制止武装颠覆，保卫国家的主权统一、领土完整和安全所进行的军事活动，以及与军事有关的政治、经济、外交、科技、教育等方面的活动”。</w:t>
+      </w:r>
+    </w:p>
+    <w:p>
+      <w:pPr>
+        <w:pStyle w:val="16"/>
+        <w:spacing w:line="360" w:lineRule="auto"/>
+        <w:rPr>
+          <w:rFonts w:ascii="Times New Roman" w:hAnsi="Times New Roman"/>
+          <w:b/>
+          <w:sz w:val="24"/>
+          <w:szCs w:val="24"/>
+        </w:rPr>
+      </w:pPr>
+      <w:r>
+        <w:rPr>
+          <w:rFonts w:ascii="Times New Roman" w:hAnsi="Times New Roman"/>
+          <w:b/>
+          <w:sz w:val="24"/>
+          <w:szCs w:val="24"/>
+        </w:rPr>
+        <w:t>2、国防具有的四个基本要素是什么：国防的主体、国防的目的、国防的对象、国防的手段。</w:t>
+      </w:r>
+    </w:p>
+    <w:p>
+      <w:pPr>
+        <w:pStyle w:val="16"/>
+        <w:spacing w:line="360" w:lineRule="auto"/>
+        <w:rPr>
+          <w:rFonts w:ascii="Times New Roman" w:hAnsi="Times New Roman"/>
+          <w:b/>
+          <w:sz w:val="24"/>
+          <w:szCs w:val="24"/>
+        </w:rPr>
+      </w:pPr>
+      <w:r>
+        <w:rPr>
+          <w:rFonts w:ascii="Times New Roman" w:hAnsi="Times New Roman"/>
+          <w:b/>
+          <w:sz w:val="24"/>
+          <w:szCs w:val="24"/>
+        </w:rPr>
+        <w:t>3、国防类型有哪些：主要有扩张型、自卫型、联盟型和中立型四种。</w:t>
+      </w:r>
+    </w:p>
+    <w:p>
+      <w:pPr>
+        <w:pStyle w:val="16"/>
+        <w:spacing w:line="360" w:lineRule="auto"/>
+        <w:rPr>
+          <w:rFonts w:ascii="Times New Roman" w:hAnsi="Times New Roman"/>
+          <w:b/>
+          <w:sz w:val="24"/>
+          <w:szCs w:val="24"/>
+        </w:rPr>
+      </w:pPr>
+      <w:r>
+        <w:rPr>
+          <w:rFonts w:ascii="Times New Roman" w:hAnsi="Times New Roman"/>
+          <w:b/>
+          <w:sz w:val="24"/>
+          <w:szCs w:val="24"/>
+        </w:rPr>
+        <w:t>4、现代国防观的具体内容主要有哪些：一是现代国防观在维护国家安全的内容上强调综合性，主要表现在：经济安全在国家安全中居于突出地位；信息安全对国家安全也至关重要；社会安全是国家安全的重要内容。</w:t>
+      </w:r>
+    </w:p>
+    <w:p>
+      <w:pPr>
+        <w:pStyle w:val="16"/>
+        <w:spacing w:line="360" w:lineRule="auto"/>
+        <w:rPr>
+          <w:rFonts w:ascii="Times New Roman" w:hAnsi="Times New Roman"/>
+          <w:b/>
+          <w:sz w:val="24"/>
+          <w:szCs w:val="24"/>
+        </w:rPr>
+      </w:pPr>
+      <w:r>
+        <w:rPr>
+          <w:rFonts w:ascii="Times New Roman" w:hAnsi="Times New Roman"/>
+          <w:b/>
+          <w:sz w:val="24"/>
+          <w:szCs w:val="24"/>
+        </w:rPr>
+        <w:t>二是现代国防观在维护国家安全的范围上有了新的拓展。</w:t>
+      </w:r>
+    </w:p>
+    <w:p>
+      <w:pPr>
+        <w:pStyle w:val="16"/>
+        <w:spacing w:line="360" w:lineRule="auto"/>
+        <w:rPr>
+          <w:rFonts w:ascii="Times New Roman" w:hAnsi="Times New Roman"/>
+          <w:b/>
+          <w:sz w:val="24"/>
+          <w:szCs w:val="24"/>
+        </w:rPr>
+      </w:pPr>
+      <w:r>
+        <w:rPr>
+          <w:rFonts w:ascii="Times New Roman" w:hAnsi="Times New Roman"/>
+          <w:b/>
+          <w:sz w:val="24"/>
+          <w:szCs w:val="24"/>
+        </w:rPr>
+        <w:t>三是现代国防现在维护国家安全利益的手段上强调多样性。</w:t>
+      </w:r>
+    </w:p>
+    <w:p>
+      <w:pPr>
+        <w:pStyle w:val="16"/>
+        <w:spacing w:line="360" w:lineRule="auto"/>
+        <w:rPr>
+          <w:rFonts w:ascii="Times New Roman" w:hAnsi="Times New Roman"/>
+          <w:b/>
+          <w:sz w:val="24"/>
+          <w:szCs w:val="24"/>
+        </w:rPr>
+      </w:pPr>
+      <w:r>
+        <w:rPr>
+          <w:rFonts w:ascii="Times New Roman" w:hAnsi="Times New Roman"/>
+          <w:b/>
+          <w:sz w:val="24"/>
+          <w:szCs w:val="24"/>
+        </w:rPr>
+        <w:t>四是现代国防观强调以经济和科技力量为基础的综台国力的重要性。</w:t>
+      </w:r>
+    </w:p>
+    <w:p>
+      <w:pPr>
+        <w:pStyle w:val="16"/>
+        <w:spacing w:line="360" w:lineRule="auto"/>
+        <w:rPr>
+          <w:rFonts w:ascii="Times New Roman" w:hAnsi="Times New Roman"/>
+          <w:b/>
+          <w:sz w:val="24"/>
+          <w:szCs w:val="24"/>
+        </w:rPr>
+      </w:pPr>
+      <w:r>
+        <w:rPr>
+          <w:rFonts w:ascii="Times New Roman" w:hAnsi="Times New Roman"/>
+          <w:b/>
+          <w:sz w:val="24"/>
+          <w:szCs w:val="24"/>
+        </w:rPr>
+        <w:t>5</w:t>
+      </w:r>
+      <w:r>
+        <w:rPr>
+          <w:rFonts w:hint="eastAsia" w:ascii="Times New Roman" w:hAnsi="Times New Roman"/>
+          <w:b/>
+          <w:sz w:val="24"/>
+          <w:szCs w:val="24"/>
+        </w:rPr>
+        <w:t>、《中华人民共和国宪法》是我国的根本大法，具有最高的法律效力和最大的权威。</w:t>
+      </w:r>
+    </w:p>
+    <w:p>
+      <w:pPr>
+        <w:pStyle w:val="16"/>
+        <w:spacing w:line="360" w:lineRule="auto"/>
+        <w:rPr>
+          <w:rFonts w:ascii="Times New Roman" w:hAnsi="Times New Roman"/>
+          <w:b/>
+          <w:sz w:val="24"/>
+          <w:szCs w:val="24"/>
+        </w:rPr>
+      </w:pPr>
+      <w:r>
+        <w:rPr>
+          <w:rFonts w:ascii="Times New Roman" w:hAnsi="Times New Roman"/>
+          <w:b/>
+          <w:sz w:val="24"/>
+          <w:szCs w:val="24"/>
+        </w:rPr>
+        <w:t>6、国防法规的特性有哪些：一是调整对象的军事性；二是司法适用的优先性；三是处罚措施的严厉性。</w:t>
+      </w:r>
+    </w:p>
+    <w:p>
+      <w:pPr>
+        <w:pStyle w:val="16"/>
+        <w:spacing w:line="360" w:lineRule="auto"/>
+        <w:rPr>
+          <w:rFonts w:ascii="Times New Roman" w:hAnsi="Times New Roman"/>
+          <w:b/>
+          <w:sz w:val="24"/>
+          <w:szCs w:val="24"/>
+        </w:rPr>
+      </w:pPr>
+      <w:r>
+        <w:rPr>
+          <w:rFonts w:ascii="Times New Roman" w:hAnsi="Times New Roman"/>
+          <w:b/>
+          <w:sz w:val="24"/>
+          <w:szCs w:val="24"/>
+        </w:rPr>
+        <w:t>7、什么是国防体制，主要有哪些：国防体制是国家进行国防建设和国防斗争的组织体系及相应的制度。是国家体制的重要组成部分，与国家的政治、经济、科学技术、文化教育等体制既互相联系又相对独立。主要包括国防领导体制、武装力量体制、国防经济体制、国防科学技术和武器装备发展的管理体制、兵役制度、动员制度、国防教育制度体制等。</w:t>
+      </w:r>
+    </w:p>
+    <w:p>
+      <w:pPr>
+        <w:pStyle w:val="16"/>
+        <w:spacing w:line="360" w:lineRule="auto"/>
+        <w:rPr>
+          <w:rFonts w:ascii="Times New Roman" w:hAnsi="Times New Roman"/>
+          <w:b/>
+          <w:sz w:val="24"/>
+          <w:szCs w:val="24"/>
+        </w:rPr>
+      </w:pPr>
+      <w:r>
+        <w:rPr>
+          <w:rFonts w:ascii="Times New Roman" w:hAnsi="Times New Roman"/>
+          <w:b/>
+          <w:sz w:val="24"/>
+          <w:szCs w:val="24"/>
+        </w:rPr>
+        <w:t>8、什么是国防战略，主要任务是什么：国防战略主要是指筹划和指导国防建设与斗争全局的方略。是国家战略的组成部分，受国家战略的指导和制约。其任务是决定国防力量的建设和发展，指导国防斗争的实施，维护国家安全利益。通常是由国家最高决策机关依据国家安全利益和国防环境，在国家战略的指导下制定的。</w:t>
+      </w:r>
+    </w:p>
+    <w:p>
+      <w:pPr>
+        <w:pStyle w:val="16"/>
+        <w:spacing w:line="360" w:lineRule="auto"/>
+        <w:rPr>
+          <w:rFonts w:ascii="Times New Roman" w:hAnsi="Times New Roman"/>
+          <w:b/>
+          <w:sz w:val="24"/>
+          <w:szCs w:val="24"/>
+        </w:rPr>
+      </w:pPr>
+      <w:r>
+        <w:rPr>
+          <w:rFonts w:ascii="Times New Roman" w:hAnsi="Times New Roman"/>
+          <w:b/>
+          <w:sz w:val="24"/>
+          <w:szCs w:val="24"/>
+        </w:rPr>
+        <w:t>9、新时代我国国防政策的主要内容有哪些：中国的社会主义国家性质，走和平发展道路的战略抉择，独立自主的和平外交政策，“和为贵”的中华文化传统，决定了中国始终不渝奉行防御性国防政策。一是坚决捍卫国家主权、安全、发展利益；这是新时代中国国防的根本目标。二是坚持永不称霸、永不扩张、永不谋求势力范围；这是新时代中国国防的鲜明特征。三是贯彻落实新时代军事战略方针；这是新时代中国国防的战略指导。四是坚持走中国特色强军之路；这是新时代中国国防的发展路径。五是服务构建人类命运共同体；这是新时代中国国防的世界意义。</w:t>
+      </w:r>
+    </w:p>
+    <w:p>
+      <w:pPr>
+        <w:pStyle w:val="16"/>
+        <w:spacing w:line="360" w:lineRule="auto"/>
+        <w:rPr>
+          <w:rFonts w:ascii="Times New Roman" w:hAnsi="Times New Roman"/>
+          <w:b/>
+          <w:sz w:val="24"/>
+          <w:szCs w:val="24"/>
+        </w:rPr>
+      </w:pPr>
+      <w:r>
+        <w:rPr>
+          <w:rFonts w:ascii="Times New Roman" w:hAnsi="Times New Roman"/>
+          <w:b/>
+          <w:sz w:val="24"/>
+          <w:szCs w:val="24"/>
+        </w:rPr>
+        <w:t>10</w:t>
+      </w:r>
+      <w:r>
+        <w:rPr>
+          <w:rFonts w:hint="eastAsia" w:ascii="Times New Roman" w:hAnsi="Times New Roman"/>
+          <w:b/>
+          <w:sz w:val="24"/>
+          <w:szCs w:val="24"/>
+        </w:rPr>
+        <w:t>、每年的9 月 3 日为中国人民抗日战争胜利纪念日。</w:t>
+      </w:r>
+    </w:p>
+    <w:p>
+      <w:pPr>
+        <w:pStyle w:val="16"/>
+        <w:spacing w:line="360" w:lineRule="auto"/>
+        <w:rPr>
+          <w:rFonts w:ascii="Times New Roman" w:hAnsi="Times New Roman"/>
+          <w:b/>
+          <w:kern w:val="0"/>
+          <w:sz w:val="24"/>
+          <w:szCs w:val="24"/>
+        </w:rPr>
+      </w:pPr>
+      <w:r>
+        <w:rPr>
+          <w:rFonts w:hint="eastAsia" w:ascii="Times New Roman" w:hAnsi="Times New Roman"/>
+          <w:b/>
+          <w:kern w:val="0"/>
+          <w:sz w:val="24"/>
+          <w:szCs w:val="24"/>
+        </w:rPr>
+        <w:t>11、伟大抗战精神是我们党在艰苦卓绝斗争中领导铸就的巍巍精神丰碑；是中国人民近代以来顽强抗争砺炼的强大精神支柱；是中华民族在战胜磨难挑战中浴火重生的鲜明精神标识。伟大抗战精神，是中国人民弥足珍贵的精神财富，将永远激励中国人民克服一切艰难险阻、为实现中华民族伟大复兴而奋斗。</w:t>
+      </w:r>
+    </w:p>
+    <w:p>
+      <w:pPr>
+        <w:pStyle w:val="16"/>
+        <w:spacing w:line="360" w:lineRule="auto"/>
+        <w:ind w:firstLine="361" w:firstLineChars="150"/>
+        <w:rPr>
+          <w:rFonts w:ascii="Times New Roman" w:hAnsi="Times New Roman"/>
+          <w:b/>
+          <w:kern w:val="0"/>
+          <w:sz w:val="24"/>
+          <w:szCs w:val="24"/>
+        </w:rPr>
+      </w:pPr>
+      <w:r>
+        <w:rPr>
+          <w:rFonts w:hint="eastAsia" w:ascii="Times New Roman" w:hAnsi="Times New Roman"/>
+          <w:b/>
+          <w:kern w:val="0"/>
+          <w:sz w:val="24"/>
+          <w:szCs w:val="24"/>
+        </w:rPr>
+        <w:t>传承和弘扬伟大抗战精神，</w:t>
+      </w:r>
+      <w:r>
+        <w:rPr>
+          <w:rFonts w:hint="eastAsia" w:ascii="Times New Roman" w:hAnsi="Times New Roman"/>
+          <w:b/>
+          <w:kern w:val="0"/>
+          <w:sz w:val="24"/>
+          <w:szCs w:val="24"/>
+          <w:highlight w:val="yellow"/>
+        </w:rPr>
+        <w:t>要厚植爱国情怀，把强国之志化为报国之行；要坚定理想信念，涵养浩然正气，不断增强做中国人的志气、骨气、底气；要激发顽强斗志，依靠顽强斗争打开事业发展新天地；要坚定必胜信心，坚定不移办好自己的事，锚定既定目标奋勇前进。</w:t>
+      </w:r>
+    </w:p>
+    <w:p>
+      <w:pPr>
+        <w:pStyle w:val="16"/>
+        <w:spacing w:line="360" w:lineRule="auto"/>
+        <w:rPr>
+          <w:rFonts w:ascii="Times New Roman" w:hAnsi="Times New Roman"/>
+          <w:b/>
+          <w:sz w:val="24"/>
+          <w:szCs w:val="24"/>
+        </w:rPr>
+      </w:pPr>
       <w:bookmarkStart w:id="3" w:name="_GoBack"/>
-      <w:bookmarkEnd w:id="3"/>
-      <w:r>
-        <w:rPr>
-          <w:rFonts w:ascii="Times New Roman" w:hAnsi="Times New Roman"/>
-          <w:b/>
-          <w:sz w:val="24"/>
-          <w:szCs w:val="24"/>
-        </w:rPr>
-        <w:t>第一部分  中国国防</w:t>
-      </w:r>
-    </w:p>
-    <w:p>
-      <w:pPr>
-        <w:pStyle w:val="16"/>
-        <w:spacing w:line="360" w:lineRule="auto"/>
-        <w:rPr>
-          <w:rFonts w:ascii="Times New Roman" w:hAnsi="Times New Roman"/>
-          <w:b/>
-          <w:sz w:val="24"/>
-          <w:szCs w:val="24"/>
-        </w:rPr>
-      </w:pPr>
-      <w:r>
-        <w:rPr>
-          <w:rFonts w:ascii="Times New Roman" w:hAnsi="Times New Roman"/>
-          <w:b/>
-          <w:sz w:val="24"/>
-          <w:szCs w:val="24"/>
-        </w:rPr>
-        <w:t>1、什么是国防：国防是“国家为防备和抵抗侵略，制止武装颠覆，保卫国家的主权统一、领土完整和安全所进行的军事活动，以及与军事有关的政治、经济、外交、科技、教育等方面的活动”。</w:t>
-      </w:r>
-    </w:p>
-    <w:p>
-      <w:pPr>
-        <w:pStyle w:val="16"/>
-        <w:spacing w:line="360" w:lineRule="auto"/>
-        <w:rPr>
-          <w:rFonts w:ascii="Times New Roman" w:hAnsi="Times New Roman"/>
-          <w:b/>
-          <w:sz w:val="24"/>
-          <w:szCs w:val="24"/>
-        </w:rPr>
-      </w:pPr>
-      <w:r>
-        <w:rPr>
-          <w:rFonts w:ascii="Times New Roman" w:hAnsi="Times New Roman"/>
-          <w:b/>
-          <w:sz w:val="24"/>
-          <w:szCs w:val="24"/>
-        </w:rPr>
-        <w:t>2、国防具有的四个基本要素是什么：国防的主体、国防的目的、国防的对象、国防的手段。</w:t>
-      </w:r>
-    </w:p>
-    <w:p>
-      <w:pPr>
-        <w:pStyle w:val="16"/>
-        <w:spacing w:line="360" w:lineRule="auto"/>
-        <w:rPr>
-          <w:rFonts w:ascii="Times New Roman" w:hAnsi="Times New Roman"/>
-          <w:b/>
-          <w:sz w:val="24"/>
-          <w:szCs w:val="24"/>
-        </w:rPr>
-      </w:pPr>
-      <w:r>
-        <w:rPr>
-          <w:rFonts w:ascii="Times New Roman" w:hAnsi="Times New Roman"/>
-          <w:b/>
-          <w:sz w:val="24"/>
-          <w:szCs w:val="24"/>
-        </w:rPr>
-        <w:t>3、国防类型有哪些：主要有扩张型、自卫型、联盟型和中立型四种。</w:t>
-      </w:r>
-    </w:p>
-    <w:p>
-      <w:pPr>
-        <w:pStyle w:val="16"/>
-        <w:spacing w:line="360" w:lineRule="auto"/>
-        <w:rPr>
-          <w:rFonts w:ascii="Times New Roman" w:hAnsi="Times New Roman"/>
-          <w:b/>
-          <w:sz w:val="24"/>
-          <w:szCs w:val="24"/>
-        </w:rPr>
-      </w:pPr>
-      <w:r>
-        <w:rPr>
-          <w:rFonts w:ascii="Times New Roman" w:hAnsi="Times New Roman"/>
-          <w:b/>
-          <w:sz w:val="24"/>
-          <w:szCs w:val="24"/>
-        </w:rPr>
-        <w:t>4、现代国防观的具体内容主要有哪些：一是现代国防观在维护国家安全的内容上强调综合性，主要表现在：经济安全在国家安全中居于突出地位；信息安全对国家安全也至关重要；社会安全是国家安全的重要内容。</w:t>
-      </w:r>
-    </w:p>
-    <w:p>
-      <w:pPr>
-        <w:pStyle w:val="16"/>
-        <w:spacing w:line="360" w:lineRule="auto"/>
-        <w:rPr>
-          <w:rFonts w:ascii="Times New Roman" w:hAnsi="Times New Roman"/>
-          <w:b/>
-          <w:sz w:val="24"/>
-          <w:szCs w:val="24"/>
-        </w:rPr>
-      </w:pPr>
-      <w:r>
-        <w:rPr>
-          <w:rFonts w:ascii="Times New Roman" w:hAnsi="Times New Roman"/>
-          <w:b/>
-          <w:sz w:val="24"/>
-          <w:szCs w:val="24"/>
-        </w:rPr>
-        <w:t>二是现代国防观在维护国家安全的范围上有了新的拓展。</w:t>
-      </w:r>
-    </w:p>
-    <w:p>
-      <w:pPr>
-        <w:pStyle w:val="16"/>
-        <w:spacing w:line="360" w:lineRule="auto"/>
-        <w:rPr>
-          <w:rFonts w:ascii="Times New Roman" w:hAnsi="Times New Roman"/>
-          <w:b/>
-          <w:sz w:val="24"/>
-          <w:szCs w:val="24"/>
-        </w:rPr>
-      </w:pPr>
-      <w:r>
-        <w:rPr>
-          <w:rFonts w:ascii="Times New Roman" w:hAnsi="Times New Roman"/>
-          <w:b/>
-          <w:sz w:val="24"/>
-          <w:szCs w:val="24"/>
-        </w:rPr>
-        <w:t>三是现代国防现在维护国家安全利益的手段上强调多样性。</w:t>
-      </w:r>
-    </w:p>
-    <w:p>
-      <w:pPr>
-        <w:pStyle w:val="16"/>
-        <w:spacing w:line="360" w:lineRule="auto"/>
-        <w:rPr>
-          <w:rFonts w:ascii="Times New Roman" w:hAnsi="Times New Roman"/>
-          <w:b/>
-          <w:sz w:val="24"/>
-          <w:szCs w:val="24"/>
-        </w:rPr>
-      </w:pPr>
-      <w:r>
-        <w:rPr>
-          <w:rFonts w:ascii="Times New Roman" w:hAnsi="Times New Roman"/>
-          <w:b/>
-          <w:sz w:val="24"/>
-          <w:szCs w:val="24"/>
-        </w:rPr>
-        <w:t>四是现代国防观强调以经济和科技力量为基础的综台国力的重要性。</w:t>
-      </w:r>
-    </w:p>
-    <w:p>
-      <w:pPr>
-        <w:pStyle w:val="16"/>
-        <w:spacing w:line="360" w:lineRule="auto"/>
-        <w:rPr>
-          <w:rFonts w:ascii="Times New Roman" w:hAnsi="Times New Roman"/>
-          <w:b/>
-          <w:sz w:val="24"/>
-          <w:szCs w:val="24"/>
-        </w:rPr>
-      </w:pPr>
-      <w:r>
-        <w:rPr>
-          <w:rFonts w:ascii="Times New Roman" w:hAnsi="Times New Roman"/>
-          <w:b/>
-          <w:sz w:val="24"/>
-          <w:szCs w:val="24"/>
-        </w:rPr>
-        <w:t>5</w:t>
-      </w:r>
-      <w:r>
-        <w:rPr>
-          <w:rFonts w:hint="eastAsia" w:ascii="Times New Roman" w:hAnsi="Times New Roman"/>
-          <w:b/>
-          <w:sz w:val="24"/>
-          <w:szCs w:val="24"/>
-        </w:rPr>
-        <w:t>、《中华人民共和国宪法》是我国的根本大法，具有最高的法律效力和最大的权威。</w:t>
-      </w:r>
-    </w:p>
-    <w:p>
-      <w:pPr>
-        <w:pStyle w:val="16"/>
-        <w:spacing w:line="360" w:lineRule="auto"/>
-        <w:rPr>
-          <w:rFonts w:ascii="Times New Roman" w:hAnsi="Times New Roman"/>
-          <w:b/>
-          <w:sz w:val="24"/>
-          <w:szCs w:val="24"/>
-        </w:rPr>
-      </w:pPr>
-      <w:r>
-        <w:rPr>
-          <w:rFonts w:ascii="Times New Roman" w:hAnsi="Times New Roman"/>
-          <w:b/>
-          <w:sz w:val="24"/>
-          <w:szCs w:val="24"/>
-        </w:rPr>
-        <w:t>6、国防法规的特性有哪些：一是调整对象的军事性；二是司法适用的优先性；三是处罚措施的严厉性。</w:t>
-      </w:r>
-    </w:p>
-    <w:p>
-      <w:pPr>
-        <w:pStyle w:val="16"/>
-        <w:spacing w:line="360" w:lineRule="auto"/>
-        <w:rPr>
-          <w:rFonts w:ascii="Times New Roman" w:hAnsi="Times New Roman"/>
-          <w:b/>
-          <w:sz w:val="24"/>
-          <w:szCs w:val="24"/>
-        </w:rPr>
-      </w:pPr>
-      <w:r>
-        <w:rPr>
-          <w:rFonts w:ascii="Times New Roman" w:hAnsi="Times New Roman"/>
-          <w:b/>
-          <w:sz w:val="24"/>
-          <w:szCs w:val="24"/>
-        </w:rPr>
-        <w:t>7、什么是国防体制，主要有哪些：国防体制是国家进行国防建设和国防斗争的组织体系及相应的制度。是国家体制的重要组成部分，与国家的政治、经济、科学技术、文化教育等体制既互相联系又相对独立。主要包括国防领导体制、武装力量体制、国防经济体制、国防科学技术和武器装备发展的管理体制、兵役制度、动员制度、国防教育制度体制等。</w:t>
-      </w:r>
-    </w:p>
-    <w:p>
-      <w:pPr>
-        <w:pStyle w:val="16"/>
-        <w:spacing w:line="360" w:lineRule="auto"/>
-        <w:rPr>
-          <w:rFonts w:ascii="Times New Roman" w:hAnsi="Times New Roman"/>
-          <w:b/>
-          <w:sz w:val="24"/>
-          <w:szCs w:val="24"/>
-        </w:rPr>
-      </w:pPr>
-      <w:r>
-        <w:rPr>
-          <w:rFonts w:ascii="Times New Roman" w:hAnsi="Times New Roman"/>
-          <w:b/>
-          <w:sz w:val="24"/>
-          <w:szCs w:val="24"/>
-        </w:rPr>
-        <w:t>8、什么是国防战略，主要任务是什么：国防战略主要是指筹划和指导国防建设与斗争全局的方略。是国家战略的组成部分，受国家战略的指导和制约。其任务是决定国防力量的建设和发展，指导国防斗争的实施，维护国家安全利益。通常是由国家最高决策机关依据国家安全利益和国防环境，在国家战略的指导下制定的。</w:t>
-      </w:r>
-    </w:p>
-    <w:p>
-      <w:pPr>
-        <w:pStyle w:val="16"/>
-        <w:spacing w:line="360" w:lineRule="auto"/>
-        <w:rPr>
-          <w:rFonts w:ascii="Times New Roman" w:hAnsi="Times New Roman"/>
-          <w:b/>
-          <w:sz w:val="24"/>
-          <w:szCs w:val="24"/>
-        </w:rPr>
-      </w:pPr>
-      <w:r>
-        <w:rPr>
-          <w:rFonts w:ascii="Times New Roman" w:hAnsi="Times New Roman"/>
-          <w:b/>
-          <w:sz w:val="24"/>
-          <w:szCs w:val="24"/>
-        </w:rPr>
-        <w:t>9、新时代我国国防政策的主要内容有哪些：中国的社会主义国家性质，走和平发展道路的战略抉择，独立自主的和平外交政策，“和为贵”的中华文化传统，决定了中国始终不渝奉行防御性国防政策。一是坚决捍卫国家主权、安全、发展利益；这是新时代中国国防的根本目标。二是坚持永不称霸、永不扩张、永不谋求势力范围；这是新时代中国国防的鲜明特征。三是贯彻落实新时代军事战略方针；这是新时代中国国防的战略指导。四是坚持走中国特色强军之路；这是新时代中国国防的发展路径。五是服务构建人类命运共同体；这是新时代中国国防的世界意义。</w:t>
-      </w:r>
-    </w:p>
-    <w:p>
-      <w:pPr>
-        <w:pStyle w:val="16"/>
-        <w:spacing w:line="360" w:lineRule="auto"/>
-        <w:rPr>
-          <w:rFonts w:ascii="Times New Roman" w:hAnsi="Times New Roman"/>
-          <w:b/>
-          <w:sz w:val="24"/>
-          <w:szCs w:val="24"/>
-        </w:rPr>
-      </w:pPr>
-      <w:r>
-        <w:rPr>
-          <w:rFonts w:ascii="Times New Roman" w:hAnsi="Times New Roman"/>
-          <w:b/>
-          <w:sz w:val="24"/>
-          <w:szCs w:val="24"/>
-        </w:rPr>
-        <w:t>10</w:t>
-      </w:r>
-      <w:r>
-        <w:rPr>
-          <w:rFonts w:hint="eastAsia" w:ascii="Times New Roman" w:hAnsi="Times New Roman"/>
-          <w:b/>
-          <w:sz w:val="24"/>
-          <w:szCs w:val="24"/>
-        </w:rPr>
-        <w:t>、每年的9 月 3 日为中国人民抗日战争胜利纪念日。</w:t>
-      </w:r>
-    </w:p>
-    <w:p>
-      <w:pPr>
-        <w:pStyle w:val="16"/>
-        <w:spacing w:line="360" w:lineRule="auto"/>
-        <w:rPr>
-          <w:rFonts w:ascii="Times New Roman" w:hAnsi="Times New Roman"/>
-          <w:b/>
-          <w:kern w:val="0"/>
-          <w:sz w:val="24"/>
-          <w:szCs w:val="24"/>
-        </w:rPr>
-      </w:pPr>
-      <w:r>
-        <w:rPr>
-          <w:rFonts w:hint="eastAsia" w:ascii="Times New Roman" w:hAnsi="Times New Roman"/>
-          <w:b/>
-          <w:kern w:val="0"/>
-          <w:sz w:val="24"/>
-          <w:szCs w:val="24"/>
-        </w:rPr>
-        <w:t>11、伟大抗战精神是我们党在艰苦卓绝斗争中领导铸就的巍巍精神丰碑；是中国人民近代以来顽强抗争砺炼的强大精神支柱；是中华民族在战胜磨难挑战中浴火重生的鲜明精神标识。伟大抗战精神，是中国人民弥足珍贵的精神财富，将永远激励中国人民克服一切艰难险阻、为实现中华民族伟大复兴而奋斗。</w:t>
-      </w:r>
-    </w:p>
-    <w:p>
-      <w:pPr>
-        <w:pStyle w:val="16"/>
-        <w:spacing w:line="360" w:lineRule="auto"/>
-        <w:ind w:firstLine="361" w:firstLineChars="150"/>
-        <w:rPr>
-          <w:rFonts w:ascii="Times New Roman" w:hAnsi="Times New Roman"/>
-          <w:b/>
-          <w:kern w:val="0"/>
-          <w:sz w:val="24"/>
-          <w:szCs w:val="24"/>
-        </w:rPr>
-      </w:pPr>
-      <w:r>
-        <w:rPr>
-          <w:rFonts w:hint="eastAsia" w:ascii="Times New Roman" w:hAnsi="Times New Roman"/>
-          <w:b/>
-          <w:kern w:val="0"/>
-          <w:sz w:val="24"/>
-          <w:szCs w:val="24"/>
-        </w:rPr>
-        <w:t>传承和弘扬伟大抗战精神，要厚植爱国情怀，把强国之志化为报国之行；要坚定理想信念，涵养浩然正气，不断增强做中国人的志气、骨气、底气；要激发顽强斗志，依靠顽强斗争打开事业发展新天地；要坚定必胜信心，坚定不移办好自己的事，锚定既定目标奋勇前进。</w:t>
-      </w:r>
-    </w:p>
-    <w:p>
-      <w:pPr>
-        <w:pStyle w:val="16"/>
-        <w:spacing w:line="360" w:lineRule="auto"/>
-        <w:rPr>
-          <w:rFonts w:ascii="Times New Roman" w:hAnsi="Times New Roman"/>
-          <w:b/>
-          <w:sz w:val="24"/>
-          <w:szCs w:val="24"/>
-        </w:rPr>
-      </w:pPr>
       <w:r>
         <w:rPr>
           <w:rFonts w:ascii="Times New Roman" w:hAnsi="Times New Roman"/>
@@ -385,25 +395,36 @@
         <w:t>12、建国以来，我国国防建设成就主要有哪些：一是捍卫和维护了国家安全利益；二是铸造了一支现代化强大军队；三是创立了国防科技和工业体系；四是国防后备力量不断发展壮大。</w:t>
       </w:r>
     </w:p>
-    <w:p>
-      <w:pPr>
-        <w:pStyle w:val="16"/>
-        <w:spacing w:line="360" w:lineRule="auto"/>
-        <w:rPr>
-          <w:rFonts w:ascii="Times New Roman" w:hAnsi="Times New Roman"/>
-          <w:b/>
-          <w:sz w:val="24"/>
-          <w:szCs w:val="24"/>
-        </w:rPr>
-      </w:pPr>
-      <w:r>
-        <w:rPr>
-          <w:rFonts w:ascii="Times New Roman" w:hAnsi="Times New Roman"/>
-          <w:b/>
-          <w:sz w:val="24"/>
-          <w:szCs w:val="24"/>
-        </w:rPr>
-        <w:t>13、什么是军民融合,如何推进军民融合：军民融合就是把国防和军队现代化建设深深融入经济社会发展体系之中，全面推进经济、科技、教育、人才等各个领域的军民融合，在更广范围、更高层次、更深程度上把国防和军队现代化建设与经济社会发展结合起来，为实现国防和军队现代化提供丰厚的资源和可持续发展的后劲。一是加快重点建设领域军民融合式发展；二是完善军地统筹建设运行模式；三是健全国防动员体制机制。</w:t>
+    <w:bookmarkEnd w:id="3"/>
+    <w:p>
+      <w:pPr>
+        <w:pStyle w:val="16"/>
+        <w:spacing w:line="360" w:lineRule="auto"/>
+        <w:rPr>
+          <w:rFonts w:ascii="Times New Roman" w:hAnsi="Times New Roman"/>
+          <w:b/>
+          <w:sz w:val="24"/>
+          <w:szCs w:val="24"/>
+        </w:rPr>
+      </w:pPr>
+      <w:r>
+        <w:rPr>
+          <w:rFonts w:ascii="Times New Roman" w:hAnsi="Times New Roman"/>
+          <w:b/>
+          <w:sz w:val="24"/>
+          <w:szCs w:val="24"/>
+        </w:rPr>
+        <w:t>13、什么是军民融合,如何推进军民融合：军民融合就是把国防和军队现代化建设深深融入经济社会发展体系之中，全面推进经济、科技、教育、人才等各个领域的军民融合，在更广范围、更高层次、更深程度上把国防和军队现代化建设与经济社会发展结合起来，为实现国防和军队现代化提供丰厚的资源和可持续发展的后劲。</w:t>
+      </w:r>
+      <w:r>
+        <w:rPr>
+          <w:rFonts w:ascii="Times New Roman" w:hAnsi="Times New Roman"/>
+          <w:b/>
+          <w:sz w:val="24"/>
+          <w:szCs w:val="24"/>
+          <w:highlight w:val="yellow"/>
+        </w:rPr>
+        <w:t>一是加快重点建设领域军民融合式发展；二是完善军地统筹建设运行模式；三是健全国防动员体制机制。</w:t>
       </w:r>
     </w:p>
     <w:p>
@@ -2020,7 +2041,28 @@
           <w:sz w:val="24"/>
           <w:szCs w:val="24"/>
         </w:rPr>
-        <w:t>12、“全球南方”并非单纯的地理概念或经济概念，它是新兴市场国家和发展中国家的集合体。</w:t>
+        <w:t>12、“全球南方”并非单纯的地理概念或经济概念，它是</w:t>
+      </w:r>
+      <w:r>
+        <w:rPr>
+          <w:rFonts w:hint="eastAsia" w:ascii="Times New Roman" w:hAnsi="Times New Roman"/>
+          <w:b/>
+          <w:kern w:val="0"/>
+          <w:sz w:val="24"/>
+          <w:szCs w:val="24"/>
+          <w:highlight w:val="yellow"/>
+        </w:rPr>
+        <w:t>新兴市场国家和发展中国家的集合体</w:t>
+      </w:r>
+      <w:r>
+        <w:rPr>
+          <w:rFonts w:hint="eastAsia" w:ascii="Times New Roman" w:hAnsi="Times New Roman"/>
+          <w:b/>
+          <w:kern w:val="0"/>
+          <w:sz w:val="24"/>
+          <w:szCs w:val="24"/>
+        </w:rPr>
+        <w:t>。</w:t>
       </w:r>
       <w:r>
         <w:rPr>
@@ -2061,7 +2103,26 @@
           <w:sz w:val="24"/>
           <w:szCs w:val="24"/>
         </w:rPr>
-        <w:t>当今时代，全球南方卓然壮大，在巩固独立成果的同时致力于赋能世界和平稳定，促进各国共同繁荣，构建合作共赢的新型国际关系，推动国际秩序更加公正合理，成为弘扬万隆精神的中坚力量。推动构建人类命运共同体，是新时代对万隆精神的伟大传承和发扬。"全球南方"要做维护和平的稳定力量、开放发展的中坚力量、全球治理的建设力量、文明互鉴的促进力量，推动构建人类命运共同体。</w:t>
+        <w:t>当今时代，全球南方卓然壮大，在巩固独立成果的同时致力于赋能世界和平稳定，促进各国共同繁荣，构建合作共赢的新型国际关系，推动国际秩序更加公正合理，成为弘扬万隆精神的中坚力量。推动构建人类命运共同体，是</w:t>
+      </w:r>
+      <w:r>
+        <w:rPr>
+          <w:rFonts w:hint="eastAsia" w:ascii="Times New Roman" w:hAnsi="Times New Roman"/>
+          <w:b/>
+          <w:sz w:val="24"/>
+          <w:szCs w:val="24"/>
+          <w:highlight w:val="yellow"/>
+        </w:rPr>
+        <w:t>新时代对万隆精神的伟大传承和发扬</w:t>
+      </w:r>
+      <w:r>
+        <w:rPr>
+          <w:rFonts w:hint="eastAsia" w:ascii="Times New Roman" w:hAnsi="Times New Roman"/>
+          <w:b/>
+          <w:sz w:val="24"/>
+          <w:szCs w:val="24"/>
+        </w:rPr>
+        <w:t>。"全球南方"要做维护和平的稳定力量、开放发展的中坚力量、全球治理的建设力量、文明互鉴的促进力量，推动构建人类命运共同体。</w:t>
       </w:r>
     </w:p>
     <w:p>

</xml_diff>